<commit_message>
Did some scene stuff
</commit_message>
<xml_diff>
--- a/src/assets/skys_horizon/textures/font/documents/arc/mission.docx
+++ b/src/assets/skys_horizon/textures/font/documents/arc/mission.docx
@@ -8,8 +8,11 @@
         <w:spacing w:before="240"/>
       </w:pPr>
       <w:r>
+        <w:rPr>
+          <w:noProof/>
+        </w:rPr>
         <w:drawing>
-          <wp:anchor distT="0" distB="0" distL="114300" distR="114300" simplePos="0" relativeHeight="251659264" behindDoc="0" locked="0" layoutInCell="1" allowOverlap="1" wp14:anchorId="0D5B3E94" wp14:editId="7F1FE3A8">
+          <wp:anchor distT="0" distB="0" distL="114300" distR="114300" simplePos="0" relativeHeight="251659264" behindDoc="0" locked="0" layoutInCell="1" allowOverlap="1" wp14:anchorId="0D5B3E94" wp14:editId="349880F8">
             <wp:simplePos x="0" y="0"/>
             <wp:positionH relativeFrom="column">
               <wp:posOffset>-3810</wp:posOffset>
@@ -32,7 +35,9 @@
                     <pic:cNvPicPr/>
                   </pic:nvPicPr>
                   <pic:blipFill>
-                    <a:blip r:embed="rId7"/>
+                    <a:blip r:embed="rId7">
+                      <a:lum bright="23000"/>
+                    </a:blip>
                     <a:stretch>
                       <a:fillRect/>
                     </a:stretch>
@@ -1458,6 +1463,7 @@
   <w:style w:type="character" w:default="1" w:styleId="DefaultParagraphFont">
     <w:name w:val="Default Paragraph Font"/>
     <w:uiPriority w:val="1"/>
+    <w:semiHidden/>
     <w:unhideWhenUsed/>
   </w:style>
   <w:style w:type="table" w:default="1" w:styleId="TableNormal">

</xml_diff>